<commit_message>
Laporan KD: perkuat sesuai rubrik PDF (Elbow + Silhouette dijelaskan untuk pemilihan K, tambah interpretasi bisnis 10 aturan ARM teratas di Appendix B), koreksi akurasi ke kode
Perbaikan feature selection menyebut dua metode (korelasi + Mutual Information entropi), Fase 1 dikoreksi ke temuan korelasi asli (hanya pasangan turunan yang berkorelasi kuat, skewness mentah ~0 vs rasio 2,4-7,4), Appendix B memakai nama item persis dari data (CC_Utilization_Category dsb) plus komentar bisnis 10 rule teratas agar memenuhi syarat minimal 10 rules terinterpretasi. Docx tetap hitam putih, heading hitam, berindentasi.

Co-authored-by: Vincent Fernandes <vincentfernandes1708@gmail.com>
Co-authored-by: Aryaka Syahrezki <198009247+aryakasyahrezki@users.noreply.github.com>
</commit_message>
<xml_diff>
--- a/Laporan_Knowledge_Discovery.docx
+++ b/Laporan_Knowledge_Discovery.docx
@@ -467,7 +467,7 @@
         <w:jc w:val="both"/>
       </w:pPr>
       <w:r>
-        <w:t xml:space="preserve">Tiga algoritma dijalankan pada ruang 3 rasio yang sama yaitu K-Means, DBSCAN, dan Hierarchical. Untuk Hierarchical, koefisien kofenetik ketiga linkage diukur dan hasilnya adalah 0,915 untuk Average, 0,842 untuk Complete, dan 0,786 untuk Ward. Meskipun secara angka Average paling tinggi, linkage Average dan Complete cenderung menghasilkan satu cluster raksasa dengan cabang cabang kecil yang timpang sehingga tidak berguna untuk segmentasi bisnis. Karena itu linkage yang dipilih adalah Ward yang menghasilkan tiga segmen paling seimbang dan interpretable sambil tetap mempertahankan koefisien kofenetik yang layak sebesar 0,786. Nilai K final ditetapkan 3 atas dasar pertimbangan domain. Pada K sama dengan 3, silhouette K-Means adalah 0,571 dan silhouette Hierarchical Ward adalah 0,459. Kesepakatan antara metode utama K-Means dan validasinya Hierarchical Ward diukur dengan Adjusted Rand Index dan menghasilkan 0,590, sebuah kesepakatan substansial yang menunjukkan kedua metode independen menempatkan mayoritas nasabah pada segmen yang sama meski keduanya mengoptimalkan tujuan yang berbeda. DBSCAN dengan eps otomatis mengisolasi 274 nasabah atau sekitar 5,5 persen sebagai noise yang kemudian dipakai sebagai sinyal awal deteksi anomali di Fase 4.</w:t>
+        <w:t xml:space="preserve">Tiga algoritma dijalankan pada ruang 3 rasio yang sama yaitu K-Means, DBSCAN, dan Hierarchical. Untuk Hierarchical, koefisien kofenetik ketiga linkage diukur dan hasilnya adalah 0,915 untuk Average, 0,842 untuk Complete, dan 0,786 untuk Ward. Meskipun secara angka Average paling tinggi, linkage Average dan Complete cenderung menghasilkan satu cluster raksasa dengan cabang cabang kecil yang timpang sehingga tidak berguna untuk segmentasi bisnis. Karena itu linkage yang dipilih adalah Ward yang menghasilkan tiga segmen paling seimbang dan interpretable sambil tetap mempertahankan koefisien kofenetik yang layak sebesar 0,786. Penentuan jumlah cluster memakai dua alat sekaligus yaitu Elbow Method pada WCSS dan Silhouette Score untuk K dari 2 sampai 10. Kurva Elbow melandai setelah K sama dengan 3 dan Silhouette murni tertinggi ada di K sama dengan 2, namun K final ditetapkan 3 karena K sama dengan 2 hanya memisahkan kelompok over-limit dari sisanya sedangkan K sama dengan 3 memunculkan segmen ketiga yang lebih actionable tanpa mengorbankan kualitas cluster. Pada K sama dengan 3, silhouette K-Means adalah 0,571 dan silhouette Hierarchical Ward adalah 0,459. Kesepakatan antara metode utama K-Means dan validasinya Hierarchical Ward diukur dengan Adjusted Rand Index dan menghasilkan 0,590, sebuah kesepakatan substansial yang menunjukkan kedua metode independen menempatkan mayoritas nasabah pada segmen yang sama meski keduanya mengoptimalkan tujuan yang berbeda. DBSCAN dengan eps otomatis mengisolasi 274 nasabah atau sekitar 5,5 persen sebagai noise yang kemudian dipakai sebagai sinyal awal deteksi anomali di Fase 4.</w:t>
       </w:r>
     </w:p>
     <w:p>
@@ -3589,6 +3589,26 @@
       <w:pPr>
         <w:spacing w:after="120"/>
       </w:pPr>
+    </w:p>
+    <w:p>
+      <w:pPr>
+        <w:spacing w:after="120" w:line="276"/>
+        <w:ind w:left="360"/>
+        <w:jc w:val="both"/>
+      </w:pPr>
+      <w:r>
+        <w:t xml:space="preserve">Interpretasi bisnis untuk sepuluh aturan teratas, diurutkan dari lift tertinggi, adalah sebagai berikut.</w:t>
+      </w:r>
+    </w:p>
+    <w:p>
+      <w:pPr>
+        <w:spacing w:after="120" w:line="276"/>
+        <w:ind w:left="360"/>
+        <w:jc w:val="both"/>
+      </w:pPr>
+      <w:r>
+        <w:t xml:space="preserve">1. Nasabah dengan pinjaman besar yang baru disetujui dan utilisasi kartu masih terkendali cenderung menyetor dana. Ini peluang menawarkan produk simpanan tepat saat arus kas masuk. 2. Pemegang kartu AMEX dengan KPR yang keluhannya belum tuntas tetap aktif menyetor. Percepat penyelesaian keluhan pending mereka karena mereka nasabah bernilai yang masih bertransaksi. 3. Nasabah giro yang puas dengan pinjaman personal dan sering melakukan transfer justru berada pada kategori bunga tinggi. Ada ruang meninjau bunga agar nasabah puas ini tidak berpindah bank. 4. Pemegang AMEX pria dengan pinjaman sangat besar cenderung berada di bunga moderat. Ini segmen premium yang cocok disasar penawaran refinancing. 5. Nasabah tabungan kelas menengah pemegang Visa dengan pinjaman disetujui banyak berada di bunga tinggi. Mereka kandidat program loyalitas untuk retensi. 6. Nasabah awal karier dengan utilisasi kartu moderat dan pinjaman menengah cenderung bertransaksi lewat transfer. Dorong adopsi kanal digital dan produk transfer bagi kelompok muda ini. 7. Nasabah giro kelas menengah yang puas dengan pinjaman personal cenderung berbunga tinggi, senada dengan aturan ketiga, sehingga penyesuaian bunga untuk retensi kembali relevan. 8. Nasabah giro perempuan berbunga tinggi yang menarik dana cenderung memakai MasterCard. Pola ini berguna untuk penargetan produk kartu berbasis segmen. 9. Nasabah pra-pensiun dengan utilisasi kartu rendah dan keluhan sudah selesai cenderung bertransaksi sangat besar. Kelompok mapan ini cocok untuk produk deposito atau investasi bernilai besar. 10. Nasabah dengan utilisasi rendah yang pinjamannya sudah lunas dan keluhannya selesai cenderung memiliki KPR. Mereka kandidat penawaran top-up KPR atau produk properti.</w:t>
+      </w:r>
     </w:p>
     <w:p>
       <w:pPr>

</xml_diff>